<commit_message>
ASI: etapa 4 — roles de los cofundadores, vesting y 20% al inversor en dos tramos; resumen ajustado a una página
Co-Authored-By: Claude Opus 5.5 <noreply@anthropic.com>
</commit_message>
<xml_diff>
--- a/materias/ASI/entregables/etapa4.docx
+++ b/materias/ASI/entregables/etapa4.docx
@@ -509,6 +509,132 @@
           </w:tcPr>
           <w:p>
             <w:pPr>
+              <w:keepNext/>
+              <w:suppressAutoHyphens/>
+              <w:spacing w:after="0" w:before="0" w:line="252"/>
+              <w:jc w:val="left"/>
+            </w:pPr>
+            <w:r>
+              <w:rPr>
+                <w:rFonts w:ascii="Lexend" w:cs="Lexend" w:eastAsia="Lexend" w:hAnsi="Lexend"/>
+                <w:color w:val="1A1A1A"/>
+                <w:sz w:val="18"/>
+                <w:szCs w:val="18"/>
+                <w:lang w:val="es-AR"/>
+              </w:rPr>
+              <w:t xml:space="preserve">1</w:t>
+            </w:r>
+          </w:p>
+        </w:tc>
+        <w:tc>
+          <w:tcPr>
+            <w:tcW w:type="dxa" w:w="1253"/>
+            <w:tcMar>
+              <w:top w:type="dxa" w:w="90"/>
+              <w:left w:type="dxa" w:w="120"/>
+              <w:bottom w:type="dxa" w:w="90"/>
+              <w:right w:type="dxa" w:w="120"/>
+            </w:tcMar>
+            <w:vAlign w:val="top"/>
+          </w:tcPr>
+          <w:p>
+            <w:pPr>
+              <w:keepNext/>
+              <w:suppressAutoHyphens/>
+              <w:spacing w:after="0" w:before="0" w:line="252"/>
+              <w:jc w:val="left"/>
+            </w:pPr>
+            <w:r>
+              <w:rPr>
+                <w:rFonts w:ascii="Lexend" w:cs="Lexend" w:eastAsia="Lexend" w:hAnsi="Lexend"/>
+                <w:color w:val="1A1A1A"/>
+                <w:sz w:val="18"/>
+                <w:szCs w:val="18"/>
+                <w:lang w:val="es-AR"/>
+              </w:rPr>
+              <w:t xml:space="preserve">14/10/2026</w:t>
+            </w:r>
+          </w:p>
+        </w:tc>
+        <w:tc>
+          <w:tcPr>
+            <w:tcW w:type="dxa" w:w="1253"/>
+            <w:tcMar>
+              <w:top w:type="dxa" w:w="90"/>
+              <w:left w:type="dxa" w:w="120"/>
+              <w:bottom w:type="dxa" w:w="90"/>
+              <w:right w:type="dxa" w:w="120"/>
+            </w:tcMar>
+            <w:vAlign w:val="top"/>
+          </w:tcPr>
+          <w:p>
+            <w:pPr>
+              <w:keepNext/>
+              <w:suppressAutoHyphens/>
+              <w:spacing w:after="0" w:before="0" w:line="252"/>
+              <w:jc w:val="left"/>
+            </w:pPr>
+            <w:r>
+              <w:rPr>
+                <w:rFonts w:ascii="Lexend" w:cs="Lexend" w:eastAsia="Lexend" w:hAnsi="Lexend"/>
+                <w:color w:val="1A1A1A"/>
+                <w:sz w:val="18"/>
+                <w:szCs w:val="18"/>
+                <w:lang w:val="es-AR"/>
+              </w:rPr>
+              <w:t xml:space="preserve">Grupo N310</w:t>
+            </w:r>
+          </w:p>
+        </w:tc>
+        <w:tc>
+          <w:tcPr>
+            <w:tcW w:type="dxa" w:w="6361"/>
+            <w:tcMar>
+              <w:top w:type="dxa" w:w="90"/>
+              <w:left w:type="dxa" w:w="120"/>
+              <w:bottom w:type="dxa" w:w="90"/>
+              <w:right w:type="dxa" w:w="120"/>
+            </w:tcMar>
+            <w:vAlign w:val="top"/>
+          </w:tcPr>
+          <w:p>
+            <w:pPr>
+              <w:keepNext/>
+              <w:suppressAutoHyphens/>
+              <w:spacing w:after="0" w:before="0" w:line="252"/>
+              <w:jc w:val="left"/>
+            </w:pPr>
+            <w:r>
+              <w:rPr>
+                <w:rFonts w:ascii="Lexend" w:cs="Lexend" w:eastAsia="Lexend" w:hAnsi="Lexend"/>
+                <w:color w:val="1A1A1A"/>
+                <w:sz w:val="18"/>
+                <w:szCs w:val="18"/>
+                <w:lang w:val="es-AR"/>
+              </w:rPr>
+              <w:t xml:space="preserve">Primera versión: idea de startup, Business Model Canvas con fuentes de ingreso y resumen para el inversor</w:t>
+            </w:r>
+          </w:p>
+        </w:tc>
+      </w:tr>
+      <w:tr>
+        <w:trPr>
+          <w:cantSplit/>
+          <w:tblHeader w:val="false"/>
+        </w:trPr>
+        <w:tc>
+          <w:tcPr>
+            <w:tcW w:type="dxa" w:w="771"/>
+            <w:tcMar>
+              <w:top w:type="dxa" w:w="90"/>
+              <w:left w:type="dxa" w:w="120"/>
+              <w:bottom w:type="dxa" w:w="90"/>
+              <w:right w:type="dxa" w:w="120"/>
+            </w:tcMar>
+            <w:vAlign w:val="top"/>
+          </w:tcPr>
+          <w:p>
+            <w:pPr>
               <w:keepNext w:val="false"/>
               <w:suppressAutoHyphens/>
               <w:spacing w:after="0" w:before="0" w:line="252"/>
@@ -522,7 +648,7 @@
                 <w:szCs w:val="18"/>
                 <w:lang w:val="es-AR"/>
               </w:rPr>
-              <w:t xml:space="preserve">1</w:t>
+              <w:t xml:space="preserve">2</w:t>
             </w:r>
           </w:p>
         </w:tc>
@@ -552,7 +678,7 @@
                 <w:szCs w:val="18"/>
                 <w:lang w:val="es-AR"/>
               </w:rPr>
-              <w:t xml:space="preserve">14/10/2026</w:t>
+              <w:t xml:space="preserve">20/10/2026</w:t>
             </w:r>
           </w:p>
         </w:tc>
@@ -612,7 +738,7 @@
                 <w:szCs w:val="18"/>
                 <w:lang w:val="es-AR"/>
               </w:rPr>
-              <w:t xml:space="preserve">Primera versión: idea de startup, Business Model Canvas con fuentes de ingreso y resumen para el inversor</w:t>
+              <w:t xml:space="preserve">Equipo fundador con un rol y una hipótesis del MVP por cofundador; pacto de socios con consolidación gradual de acciones; participación ofrecida al inversor, en dos tramos atados al piloto; resumen para el inversor ajustado a una página</w:t>
             </w:r>
           </w:p>
         </w:tc>
@@ -3753,7 +3879,7 @@
                 <w:szCs w:val="18"/>
                 <w:lang w:val="es-AR"/>
               </w:rPr>
-              <w:t xml:space="preserve">El MVP valida H1 a H5 antes de construir el motor completo</w:t>
+              <w:t xml:space="preserve">El MVP valida H1 a H5 antes de construir el motor completo, y la segunda mitad de la inversión se libera recién cuando el municipio piloto firma la suscripción (H4)</w:t>
             </w:r>
           </w:p>
         </w:tc>
@@ -3819,7 +3945,29 @@
                 <w:szCs w:val="18"/>
                 <w:lang w:val="es-AR"/>
               </w:rPr>
-              <w:t xml:space="preserve">Pacto de socios en la constitución de la SAS: roles, dedicación y salida</w:t>
+              <w:t xml:space="preserve">Pacto de socios en la constitución de la SAS: un rol y una hipótesis del MVP por cofundador (punto 2.6), dedicación y salida. Las acciones de cada cofundador se consolidan de forma gradual en cuatro años, con un mínimo de uno (</w:t>
+            </w:r>
+            <w:r>
+              <w:rPr>
+                <w:rFonts w:ascii="Lexend" w:cs="Lexend" w:eastAsia="Lexend" w:hAnsi="Lexend"/>
+                <w:i/>
+                <w:iCs/>
+                <w:color w:val="1A1A1A"/>
+                <w:sz w:val="18"/>
+                <w:szCs w:val="18"/>
+                <w:lang w:val="es-AR"/>
+              </w:rPr>
+              <w:t xml:space="preserve">vesting</w:t>
+            </w:r>
+            <w:r>
+              <w:rPr>
+                <w:rFonts w:ascii="Lexend" w:cs="Lexend" w:eastAsia="Lexend" w:hAnsi="Lexend"/>
+                <w:color w:val="1A1A1A"/>
+                <w:sz w:val="18"/>
+                <w:szCs w:val="18"/>
+                <w:lang w:val="es-AR"/>
+              </w:rPr>
+              <w:t xml:space="preserve">): quien se va antes del primer año no conserva acciones, y quien se va a los dos años conserva la mitad</w:t>
             </w:r>
           </w:p>
         </w:tc>
@@ -9258,7 +9406,7 @@
                 <w:szCs w:val="18"/>
                 <w:lang w:val="es-AR"/>
               </w:rPr>
-              <w:t xml:space="preserve">Los cinco cofundadores, estudiantes avanzados de Ingeniería en Sistemas; a partir del año 2, un desarrollador y una persona de implementación y soporte</w:t>
+              <w:t xml:space="preserve">Los cinco cofundadores, estudiantes avanzados de Ingeniería en Sistemas, con un frente y una hipótesis del MVP cada uno (tabla siguiente); a partir del año 2, un desarrollador, que se suma a tecnología, y una persona de implementación y soporte, que se suma a operaciones</w:t>
             </w:r>
           </w:p>
         </w:tc>
@@ -9324,7 +9472,7 @@
                 <w:szCs w:val="18"/>
                 <w:lang w:val="es-AR"/>
               </w:rPr>
-              <w:t xml:space="preserve">Ronda inicial de inversión y aportes no reembolsables de los programas de emprendedores (ver punto 3)</w:t>
+              <w:t xml:space="preserve">Ronda inicial de USD 70.000 por el 20% de la SAS, que valúa la empresa en USD 350.000 después de la inversión. Entra en dos tramos de USD 35.000: el segundo se libera cuando el municipio piloto firma la suscripción (H4). Se complementa con aportes no reembolsables de los programas de emprendedores (ver punto 3)</w:t>
             </w:r>
           </w:p>
         </w:tc>
@@ -9391,6 +9539,643 @@
                 <w:lang w:val="es-AR"/>
               </w:rPr>
               <w:t xml:space="preserve">Mínimos: notebooks y celulares de prueba. No hay hardware en la calle: el sensor es el celular del vecino y el de la cuadrilla</w:t>
+            </w:r>
+          </w:p>
+        </w:tc>
+      </w:tr>
+    </w:tbl>
+    <w:p>
+      <w:pPr>
+        <w:spacing w:after="160"/>
+      </w:pPr>
+    </w:p>
+    <w:p>
+      <w:pPr>
+        <w:spacing w:after="120" w:line="280"/>
+        <w:jc w:val="both"/>
+      </w:pPr>
+      <w:r>
+        <w:rPr>
+          <w:rFonts w:ascii="Lexend" w:cs="Lexend" w:eastAsia="Lexend" w:hAnsi="Lexend"/>
+          <w:b/>
+          <w:bCs/>
+          <w:color w:val="1A1A1A"/>
+          <w:sz w:val="22"/>
+          <w:szCs w:val="22"/>
+          <w:lang w:val="es-AR"/>
+        </w:rPr>
+        <w:t xml:space="preserve">Equipo fundador.</w:t>
+      </w:r>
+      <w:r>
+        <w:rPr>
+          <w:rFonts w:ascii="Lexend" w:cs="Lexend" w:eastAsia="Lexend" w:hAnsi="Lexend"/>
+          <w:color w:val="1A1A1A"/>
+          <w:sz w:val="22"/>
+          <w:szCs w:val="22"/>
+          <w:lang w:val="es-AR"/>
+        </w:rPr>
+        <w:t xml:space="preserve"> Cada cofundador lleva un frente del negocio y responde por una de las hipótesis del MVP (punto 1), de modo que cada resultado del piloto tiene un responsable.</w:t>
+      </w:r>
+    </w:p>
+    <w:tbl>
+      <w:tblPr>
+        <w:tblW w:type="dxa" w:w="9638"/>
+        <w:tblBorders>
+          <w:top w:val="single" w:color="BFD3E6" w:sz="4"/>
+          <w:left w:val="single" w:color="DCE7F2" w:sz="2"/>
+          <w:bottom w:val="single" w:color="BFD3E6" w:sz="4"/>
+          <w:right w:val="single" w:color="DCE7F2" w:sz="2"/>
+          <w:insideH w:val="single" w:color="BFD3E6" w:sz="2"/>
+          <w:insideV w:val="single" w:color="DCE7F2" w:sz="2"/>
+        </w:tblBorders>
+        <w:tblLayout w:type="fixed"/>
+      </w:tblPr>
+      <w:tblGrid>
+        <w:gridCol w:w="2120"/>
+        <w:gridCol w:w="5397"/>
+        <w:gridCol w:w="2121"/>
+      </w:tblGrid>
+      <w:tr>
+        <w:trPr>
+          <w:cantSplit/>
+          <w:tblHeader/>
+        </w:trPr>
+        <w:tc>
+          <w:tcPr>
+            <w:tcW w:type="dxa" w:w="2120"/>
+            <w:shd w:fill="DCE9F7" w:color="auto" w:val="clear"/>
+            <w:tcMar>
+              <w:top w:type="dxa" w:w="90"/>
+              <w:left w:type="dxa" w:w="120"/>
+              <w:bottom w:type="dxa" w:w="90"/>
+              <w:right w:type="dxa" w:w="120"/>
+            </w:tcMar>
+            <w:vAlign w:val="center"/>
+          </w:tcPr>
+          <w:p>
+            <w:pPr>
+              <w:keepNext/>
+              <w:suppressAutoHyphens/>
+              <w:spacing w:after="0" w:before="0" w:line="252"/>
+              <w:jc w:val="left"/>
+            </w:pPr>
+            <w:r>
+              <w:rPr>
+                <w:rFonts w:ascii="Lexend" w:cs="Lexend" w:eastAsia="Lexend" w:hAnsi="Lexend"/>
+                <w:b/>
+                <w:bCs/>
+                <w:color w:val="15406B"/>
+                <w:sz w:val="18"/>
+                <w:szCs w:val="18"/>
+                <w:lang w:val="es-AR"/>
+              </w:rPr>
+              <w:t xml:space="preserve">Rol</w:t>
+            </w:r>
+          </w:p>
+        </w:tc>
+        <w:tc>
+          <w:tcPr>
+            <w:tcW w:type="dxa" w:w="5397"/>
+            <w:shd w:fill="DCE9F7" w:color="auto" w:val="clear"/>
+            <w:tcMar>
+              <w:top w:type="dxa" w:w="90"/>
+              <w:left w:type="dxa" w:w="120"/>
+              <w:bottom w:type="dxa" w:w="90"/>
+              <w:right w:type="dxa" w:w="120"/>
+            </w:tcMar>
+            <w:vAlign w:val="center"/>
+          </w:tcPr>
+          <w:p>
+            <w:pPr>
+              <w:keepNext/>
+              <w:suppressAutoHyphens/>
+              <w:spacing w:after="0" w:before="0" w:line="252"/>
+              <w:jc w:val="left"/>
+            </w:pPr>
+            <w:r>
+              <w:rPr>
+                <w:rFonts w:ascii="Lexend" w:cs="Lexend" w:eastAsia="Lexend" w:hAnsi="Lexend"/>
+                <w:b/>
+                <w:bCs/>
+                <w:color w:val="15406B"/>
+                <w:sz w:val="18"/>
+                <w:szCs w:val="18"/>
+                <w:lang w:val="es-AR"/>
+              </w:rPr>
+              <w:t xml:space="preserve">Responsabilidades</w:t>
+            </w:r>
+          </w:p>
+        </w:tc>
+        <w:tc>
+          <w:tcPr>
+            <w:tcW w:type="dxa" w:w="2121"/>
+            <w:shd w:fill="DCE9F7" w:color="auto" w:val="clear"/>
+            <w:tcMar>
+              <w:top w:type="dxa" w:w="90"/>
+              <w:left w:type="dxa" w:w="120"/>
+              <w:bottom w:type="dxa" w:w="90"/>
+              <w:right w:type="dxa" w:w="120"/>
+            </w:tcMar>
+            <w:vAlign w:val="center"/>
+          </w:tcPr>
+          <w:p>
+            <w:pPr>
+              <w:keepNext/>
+              <w:suppressAutoHyphens/>
+              <w:spacing w:after="0" w:before="0" w:line="252"/>
+              <w:jc w:val="left"/>
+            </w:pPr>
+            <w:r>
+              <w:rPr>
+                <w:rFonts w:ascii="Lexend" w:cs="Lexend" w:eastAsia="Lexend" w:hAnsi="Lexend"/>
+                <w:b/>
+                <w:bCs/>
+                <w:color w:val="15406B"/>
+                <w:sz w:val="18"/>
+                <w:szCs w:val="18"/>
+                <w:lang w:val="es-AR"/>
+              </w:rPr>
+              <w:t xml:space="preserve">Hipótesis que lidera</w:t>
+            </w:r>
+          </w:p>
+        </w:tc>
+      </w:tr>
+      <w:tr>
+        <w:trPr>
+          <w:cantSplit/>
+          <w:tblHeader w:val="false"/>
+        </w:trPr>
+        <w:tc>
+          <w:tcPr>
+            <w:tcW w:type="dxa" w:w="2120"/>
+            <w:tcMar>
+              <w:top w:type="dxa" w:w="90"/>
+              <w:left w:type="dxa" w:w="120"/>
+              <w:bottom w:type="dxa" w:w="90"/>
+              <w:right w:type="dxa" w:w="120"/>
+            </w:tcMar>
+            <w:vAlign w:val="top"/>
+          </w:tcPr>
+          <w:p>
+            <w:pPr>
+              <w:keepNext/>
+              <w:suppressAutoHyphens/>
+              <w:spacing w:after="0" w:before="0" w:line="252"/>
+              <w:jc w:val="left"/>
+            </w:pPr>
+            <w:r>
+              <w:rPr>
+                <w:rFonts w:ascii="Lexend" w:cs="Lexend" w:eastAsia="Lexend" w:hAnsi="Lexend"/>
+                <w:color w:val="1A1A1A"/>
+                <w:sz w:val="18"/>
+                <w:szCs w:val="18"/>
+                <w:lang w:val="es-AR"/>
+              </w:rPr>
+              <w:t xml:space="preserve">Dirección y municipios</w:t>
+            </w:r>
+          </w:p>
+        </w:tc>
+        <w:tc>
+          <w:tcPr>
+            <w:tcW w:type="dxa" w:w="5397"/>
+            <w:tcMar>
+              <w:top w:type="dxa" w:w="90"/>
+              <w:left w:type="dxa" w:w="120"/>
+              <w:bottom w:type="dxa" w:w="90"/>
+              <w:right w:type="dxa" w:w="120"/>
+            </w:tcMar>
+            <w:vAlign w:val="top"/>
+          </w:tcPr>
+          <w:p>
+            <w:pPr>
+              <w:keepNext/>
+              <w:suppressAutoHyphens/>
+              <w:spacing w:after="0" w:before="0" w:line="252"/>
+              <w:jc w:val="left"/>
+            </w:pPr>
+            <w:r>
+              <w:rPr>
+                <w:rFonts w:ascii="Lexend" w:cs="Lexend" w:eastAsia="Lexend" w:hAnsi="Lexend"/>
+                <w:color w:val="1A1A1A"/>
+                <w:sz w:val="18"/>
+                <w:szCs w:val="18"/>
+                <w:lang w:val="es-AR"/>
+              </w:rPr>
+              <w:t xml:space="preserve">Venta institucional a los municipios, negociación del piloto y relación con el inversor y con los programas de emprendedores</w:t>
+            </w:r>
+          </w:p>
+        </w:tc>
+        <w:tc>
+          <w:tcPr>
+            <w:tcW w:type="dxa" w:w="2121"/>
+            <w:tcMar>
+              <w:top w:type="dxa" w:w="90"/>
+              <w:left w:type="dxa" w:w="120"/>
+              <w:bottom w:type="dxa" w:w="90"/>
+              <w:right w:type="dxa" w:w="120"/>
+            </w:tcMar>
+            <w:vAlign w:val="top"/>
+          </w:tcPr>
+          <w:p>
+            <w:pPr>
+              <w:keepNext/>
+              <w:suppressAutoHyphens/>
+              <w:spacing w:after="0" w:before="0" w:line="252"/>
+              <w:jc w:val="left"/>
+            </w:pPr>
+            <w:r>
+              <w:rPr>
+                <w:rFonts w:ascii="Lexend" w:cs="Lexend" w:eastAsia="Lexend" w:hAnsi="Lexend"/>
+                <w:color w:val="1A1A1A"/>
+                <w:sz w:val="18"/>
+                <w:szCs w:val="18"/>
+                <w:lang w:val="es-AR"/>
+              </w:rPr>
+              <w:t xml:space="preserve">H4 — el municipio paga</w:t>
+            </w:r>
+          </w:p>
+        </w:tc>
+      </w:tr>
+      <w:tr>
+        <w:trPr>
+          <w:cantSplit/>
+          <w:tblHeader w:val="false"/>
+        </w:trPr>
+        <w:tc>
+          <w:tcPr>
+            <w:tcW w:type="dxa" w:w="2120"/>
+            <w:tcMar>
+              <w:top w:type="dxa" w:w="90"/>
+              <w:left w:type="dxa" w:w="120"/>
+              <w:bottom w:type="dxa" w:w="90"/>
+              <w:right w:type="dxa" w:w="120"/>
+            </w:tcMar>
+            <w:vAlign w:val="top"/>
+          </w:tcPr>
+          <w:p>
+            <w:pPr>
+              <w:keepNext/>
+              <w:suppressAutoHyphens/>
+              <w:spacing w:after="0" w:before="0" w:line="252"/>
+              <w:jc w:val="left"/>
+            </w:pPr>
+            <w:r>
+              <w:rPr>
+                <w:rFonts w:ascii="Lexend" w:cs="Lexend" w:eastAsia="Lexend" w:hAnsi="Lexend"/>
+                <w:color w:val="1A1A1A"/>
+                <w:sz w:val="18"/>
+                <w:szCs w:val="18"/>
+                <w:lang w:val="es-AR"/>
+              </w:rPr>
+              <w:t xml:space="preserve">Prestadoras y alianzas</w:t>
+            </w:r>
+          </w:p>
+        </w:tc>
+        <w:tc>
+          <w:tcPr>
+            <w:tcW w:type="dxa" w:w="5397"/>
+            <w:tcMar>
+              <w:top w:type="dxa" w:w="90"/>
+              <w:left w:type="dxa" w:w="120"/>
+              <w:bottom w:type="dxa" w:w="90"/>
+              <w:right w:type="dxa" w:w="120"/>
+            </w:tcMar>
+            <w:vAlign w:val="top"/>
+          </w:tcPr>
+          <w:p>
+            <w:pPr>
+              <w:keepNext/>
+              <w:suppressAutoHyphens/>
+              <w:spacing w:after="0" w:before="0" w:line="252"/>
+              <w:jc w:val="left"/>
+            </w:pPr>
+            <w:r>
+              <w:rPr>
+                <w:rFonts w:ascii="Lexend" w:cs="Lexend" w:eastAsia="Lexend" w:hAnsi="Lexend"/>
+                <w:color w:val="1A1A1A"/>
+                <w:sz w:val="18"/>
+                <w:szCs w:val="18"/>
+                <w:lang w:val="es-AR"/>
+              </w:rPr>
+              <w:t xml:space="preserve">Venta a las prestadoras y licencias por cuadrilla; relación con Personal y con los socios del ecosistema. Sostiene el pivot previsto si H4 falla</w:t>
+            </w:r>
+          </w:p>
+        </w:tc>
+        <w:tc>
+          <w:tcPr>
+            <w:tcW w:type="dxa" w:w="2121"/>
+            <w:tcMar>
+              <w:top w:type="dxa" w:w="90"/>
+              <w:left w:type="dxa" w:w="120"/>
+              <w:bottom w:type="dxa" w:w="90"/>
+              <w:right w:type="dxa" w:w="120"/>
+            </w:tcMar>
+            <w:vAlign w:val="top"/>
+          </w:tcPr>
+          <w:p>
+            <w:pPr>
+              <w:keepNext/>
+              <w:suppressAutoHyphens/>
+              <w:spacing w:after="0" w:before="0" w:line="252"/>
+              <w:jc w:val="left"/>
+            </w:pPr>
+            <w:r>
+              <w:rPr>
+                <w:rFonts w:ascii="Lexend" w:cs="Lexend" w:eastAsia="Lexend" w:hAnsi="Lexend"/>
+                <w:color w:val="1A1A1A"/>
+                <w:sz w:val="18"/>
+                <w:szCs w:val="18"/>
+                <w:lang w:val="es-AR"/>
+              </w:rPr>
+              <w:t xml:space="preserve">H5 — las prestadoras aceptan los reclamos ruteados</w:t>
+            </w:r>
+          </w:p>
+        </w:tc>
+      </w:tr>
+      <w:tr>
+        <w:trPr>
+          <w:cantSplit/>
+          <w:tblHeader w:val="false"/>
+        </w:trPr>
+        <w:tc>
+          <w:tcPr>
+            <w:tcW w:type="dxa" w:w="2120"/>
+            <w:tcMar>
+              <w:top w:type="dxa" w:w="90"/>
+              <w:left w:type="dxa" w:w="120"/>
+              <w:bottom w:type="dxa" w:w="90"/>
+              <w:right w:type="dxa" w:w="120"/>
+            </w:tcMar>
+            <w:vAlign w:val="top"/>
+          </w:tcPr>
+          <w:p>
+            <w:pPr>
+              <w:keepNext/>
+              <w:suppressAutoHyphens/>
+              <w:spacing w:after="0" w:before="0" w:line="252"/>
+              <w:jc w:val="left"/>
+            </w:pPr>
+            <w:r>
+              <w:rPr>
+                <w:rFonts w:ascii="Lexend" w:cs="Lexend" w:eastAsia="Lexend" w:hAnsi="Lexend"/>
+                <w:color w:val="1A1A1A"/>
+                <w:sz w:val="18"/>
+                <w:szCs w:val="18"/>
+                <w:lang w:val="es-AR"/>
+              </w:rPr>
+              <w:t xml:space="preserve">Tecnología</w:t>
+            </w:r>
+          </w:p>
+        </w:tc>
+        <w:tc>
+          <w:tcPr>
+            <w:tcW w:type="dxa" w:w="5397"/>
+            <w:tcMar>
+              <w:top w:type="dxa" w:w="90"/>
+              <w:left w:type="dxa" w:w="120"/>
+              <w:bottom w:type="dxa" w:w="90"/>
+              <w:right w:type="dxa" w:w="120"/>
+            </w:tcMar>
+            <w:vAlign w:val="top"/>
+          </w:tcPr>
+          <w:p>
+            <w:pPr>
+              <w:keepNext/>
+              <w:suppressAutoHyphens/>
+              <w:spacing w:after="0" w:before="0" w:line="252"/>
+              <w:jc w:val="left"/>
+            </w:pPr>
+            <w:r>
+              <w:rPr>
+                <w:rFonts w:ascii="Lexend" w:cs="Lexend" w:eastAsia="Lexend" w:hAnsi="Lexend"/>
+                <w:color w:val="1A1A1A"/>
+                <w:sz w:val="18"/>
+                <w:szCs w:val="18"/>
+                <w:lang w:val="es-AR"/>
+              </w:rPr>
+              <w:t xml:space="preserve">Plataforma, app de cuadrilla y medición de tiempos, conectores, seguridad y protección de los datos personales. El motor de ruteo se construye recién cuando el piloto valida la demanda</w:t>
+            </w:r>
+          </w:p>
+        </w:tc>
+        <w:tc>
+          <w:tcPr>
+            <w:tcW w:type="dxa" w:w="2121"/>
+            <w:tcMar>
+              <w:top w:type="dxa" w:w="90"/>
+              <w:left w:type="dxa" w:w="120"/>
+              <w:bottom w:type="dxa" w:w="90"/>
+              <w:right w:type="dxa" w:w="120"/>
+            </w:tcMar>
+            <w:vAlign w:val="top"/>
+          </w:tcPr>
+          <w:p>
+            <w:pPr>
+              <w:keepNext/>
+              <w:suppressAutoHyphens/>
+              <w:spacing w:after="0" w:before="0" w:line="252"/>
+              <w:jc w:val="left"/>
+            </w:pPr>
+            <w:r>
+              <w:rPr>
+                <w:rFonts w:ascii="Lexend" w:cs="Lexend" w:eastAsia="Lexend" w:hAnsi="Lexend"/>
+                <w:color w:val="1A1A1A"/>
+                <w:sz w:val="18"/>
+                <w:szCs w:val="18"/>
+                <w:lang w:val="es-AR"/>
+              </w:rPr>
+              <w:t xml:space="preserve">H3 — la trazabilidad acorta los tiempos</w:t>
+            </w:r>
+          </w:p>
+        </w:tc>
+      </w:tr>
+      <w:tr>
+        <w:trPr>
+          <w:cantSplit/>
+          <w:tblHeader w:val="false"/>
+        </w:trPr>
+        <w:tc>
+          <w:tcPr>
+            <w:tcW w:type="dxa" w:w="2120"/>
+            <w:tcMar>
+              <w:top w:type="dxa" w:w="90"/>
+              <w:left w:type="dxa" w:w="120"/>
+              <w:bottom w:type="dxa" w:w="90"/>
+              <w:right w:type="dxa" w:w="120"/>
+            </w:tcMar>
+            <w:vAlign w:val="top"/>
+          </w:tcPr>
+          <w:p>
+            <w:pPr>
+              <w:keepNext/>
+              <w:suppressAutoHyphens/>
+              <w:spacing w:after="0" w:before="0" w:line="252"/>
+              <w:jc w:val="left"/>
+            </w:pPr>
+            <w:r>
+              <w:rPr>
+                <w:rFonts w:ascii="Lexend" w:cs="Lexend" w:eastAsia="Lexend" w:hAnsi="Lexend"/>
+                <w:color w:val="1A1A1A"/>
+                <w:sz w:val="18"/>
+                <w:szCs w:val="18"/>
+                <w:lang w:val="es-AR"/>
+              </w:rPr>
+              <w:t xml:space="preserve">Producto y datos</w:t>
+            </w:r>
+          </w:p>
+        </w:tc>
+        <w:tc>
+          <w:tcPr>
+            <w:tcW w:type="dxa" w:w="5397"/>
+            <w:tcMar>
+              <w:top w:type="dxa" w:w="90"/>
+              <w:left w:type="dxa" w:w="120"/>
+              <w:bottom w:type="dxa" w:w="90"/>
+              <w:right w:type="dxa" w:w="120"/>
+            </w:tcMar>
+            <w:vAlign w:val="top"/>
+          </w:tcPr>
+          <w:p>
+            <w:pPr>
+              <w:keepNext/>
+              <w:suppressAutoHyphens/>
+              <w:spacing w:after="0" w:before="0" w:line="252"/>
+              <w:jc w:val="left"/>
+            </w:pPr>
+            <w:r>
+              <w:rPr>
+                <w:rFonts w:ascii="Lexend" w:cs="Lexend" w:eastAsia="Lexend" w:hAnsi="Lexend"/>
+                <w:color w:val="1A1A1A"/>
+                <w:sz w:val="18"/>
+                <w:szCs w:val="18"/>
+                <w:lang w:val="es-AR"/>
+              </w:rPr>
+              <w:t xml:space="preserve">App del vecino, tablero público, conjunto de datos abiertos e informes</w:t>
+            </w:r>
+          </w:p>
+        </w:tc>
+        <w:tc>
+          <w:tcPr>
+            <w:tcW w:type="dxa" w:w="2121"/>
+            <w:tcMar>
+              <w:top w:type="dxa" w:w="90"/>
+              <w:left w:type="dxa" w:w="120"/>
+              <w:bottom w:type="dxa" w:w="90"/>
+              <w:right w:type="dxa" w:w="120"/>
+            </w:tcMar>
+            <w:vAlign w:val="top"/>
+          </w:tcPr>
+          <w:p>
+            <w:pPr>
+              <w:keepNext/>
+              <w:suppressAutoHyphens/>
+              <w:spacing w:after="0" w:before="0" w:line="252"/>
+              <w:jc w:val="left"/>
+            </w:pPr>
+            <w:r>
+              <w:rPr>
+                <w:rFonts w:ascii="Lexend" w:cs="Lexend" w:eastAsia="Lexend" w:hAnsi="Lexend"/>
+                <w:color w:val="1A1A1A"/>
+                <w:sz w:val="18"/>
+                <w:szCs w:val="18"/>
+                <w:lang w:val="es-AR"/>
+              </w:rPr>
+              <w:t xml:space="preserve">H1 — los vecinos usan el canal nuevo</w:t>
+            </w:r>
+          </w:p>
+        </w:tc>
+      </w:tr>
+      <w:tr>
+        <w:trPr>
+          <w:cantSplit/>
+          <w:tblHeader w:val="false"/>
+        </w:trPr>
+        <w:tc>
+          <w:tcPr>
+            <w:tcW w:type="dxa" w:w="2120"/>
+            <w:tcMar>
+              <w:top w:type="dxa" w:w="90"/>
+              <w:left w:type="dxa" w:w="120"/>
+              <w:bottom w:type="dxa" w:w="90"/>
+              <w:right w:type="dxa" w:w="120"/>
+            </w:tcMar>
+            <w:vAlign w:val="top"/>
+          </w:tcPr>
+          <w:p>
+            <w:pPr>
+              <w:keepNext w:val="false"/>
+              <w:suppressAutoHyphens/>
+              <w:spacing w:after="0" w:before="0" w:line="252"/>
+              <w:jc w:val="left"/>
+            </w:pPr>
+            <w:r>
+              <w:rPr>
+                <w:rFonts w:ascii="Lexend" w:cs="Lexend" w:eastAsia="Lexend" w:hAnsi="Lexend"/>
+                <w:color w:val="1A1A1A"/>
+                <w:sz w:val="18"/>
+                <w:szCs w:val="18"/>
+                <w:lang w:val="es-AR"/>
+              </w:rPr>
+              <w:t xml:space="preserve">Operaciones e implementación</w:t>
+            </w:r>
+          </w:p>
+        </w:tc>
+        <w:tc>
+          <w:tcPr>
+            <w:tcW w:type="dxa" w:w="5397"/>
+            <w:tcMar>
+              <w:top w:type="dxa" w:w="90"/>
+              <w:left w:type="dxa" w:w="120"/>
+              <w:bottom w:type="dxa" w:w="90"/>
+              <w:right w:type="dxa" w:w="120"/>
+            </w:tcMar>
+            <w:vAlign w:val="top"/>
+          </w:tcPr>
+          <w:p>
+            <w:pPr>
+              <w:keepNext w:val="false"/>
+              <w:suppressAutoHyphens/>
+              <w:spacing w:after="0" w:before="0" w:line="252"/>
+              <w:jc w:val="left"/>
+            </w:pPr>
+            <w:r>
+              <w:rPr>
+                <w:rFonts w:ascii="Lexend" w:cs="Lexend" w:eastAsia="Lexend" w:hAnsi="Lexend"/>
+                <w:color w:val="1A1A1A"/>
+                <w:sz w:val="18"/>
+                <w:szCs w:val="18"/>
+                <w:lang w:val="es-AR"/>
+              </w:rPr>
+              <w:t xml:space="preserve">Ruteo manual de los reclamos durante el piloto, alta de cada municipio nuevo, capacitación de las cuadrillas y mesa de ayuda</w:t>
+            </w:r>
+          </w:p>
+        </w:tc>
+        <w:tc>
+          <w:tcPr>
+            <w:tcW w:type="dxa" w:w="2121"/>
+            <w:tcMar>
+              <w:top w:type="dxa" w:w="90"/>
+              <w:left w:type="dxa" w:w="120"/>
+              <w:bottom w:type="dxa" w:w="90"/>
+              <w:right w:type="dxa" w:w="120"/>
+            </w:tcMar>
+            <w:vAlign w:val="top"/>
+          </w:tcPr>
+          <w:p>
+            <w:pPr>
+              <w:keepNext w:val="false"/>
+              <w:suppressAutoHyphens/>
+              <w:spacing w:after="0" w:before="0" w:line="252"/>
+              <w:jc w:val="left"/>
+            </w:pPr>
+            <w:r>
+              <w:rPr>
+                <w:rFonts w:ascii="Lexend" w:cs="Lexend" w:eastAsia="Lexend" w:hAnsi="Lexend"/>
+                <w:color w:val="1A1A1A"/>
+                <w:sz w:val="18"/>
+                <w:szCs w:val="18"/>
+                <w:lang w:val="es-AR"/>
+              </w:rPr>
+              <w:t xml:space="preserve">H2 — buena parte de los reclamos son repetidos</w:t>
             </w:r>
           </w:p>
         </w:tc>
@@ -11463,7 +12248,7 @@
           <w:szCs w:val="22"/>
           <w:lang w:val="es-AR"/>
         </w:rPr>
-        <w:t xml:space="preserve"> En las ciudades medianas, un bache, una luminaria apagada o un cable caído se reclaman por teléfono, redes o mensajería, muchas veces a quien no corresponde. El mismo problema entra veinte veces y nadie sabe cuánto tarda en resolverse. Rosario resolvió la recepción de reclamos para su ámbito con el 147 y su centro de operaciones. Los municipios del Gran Rosario no pueden pagarse algo así, y ni siquiera en Rosario el reclamo llega integrado a las empresas de servicios que trabajan en la calle.</w:t>
+        <w:t xml:space="preserve"> En las ciudades medianas, un bache, una luminaria apagada o un cable caído se reclaman por teléfono, redes o mensajería, a menudo a quien no corresponde. El mismo problema entra veinte veces y nadie sabe cuándo se resuelve. Rosario lo resolvió para su ámbito con el 147, pero los municipios del Gran Rosario no pueden costearlo, y ni en Rosario el reclamo llega a las prestadoras que trabajan en la calle.</w:t>
       </w:r>
     </w:p>
     <w:p>
@@ -11491,7 +12276,7 @@
           <w:szCs w:val="22"/>
           <w:lang w:val="es-AR"/>
         </w:rPr>
-        <w:t xml:space="preserve"> Una plataforma en la nube con cuatro piezas. El vecino reclama con una foto y sigue su reclamo. Un motor de ruteo lo envía al área municipal o a la prestadora que corresponde y agrupa los reclamos repetidos. La cuadrilla resuelve con la orden de trabajo en el celular y cierra con foto. Un tablero público muestra cuánto tarda cada responsable, con datos abiertos y anonimizados.</w:t>
+        <w:t xml:space="preserve"> Una plataforma en la nube: el vecino reclama con una foto y sigue su reclamo, un motor de ruteo lo envía al área municipal o a la prestadora que corresponde y agrupa los repetidos, la cuadrilla recibe la orden en el celular y cierra con foto, y un tablero público muestra cuánto tarda cada responsable, con datos abiertos.</w:t>
       </w:r>
     </w:p>
     <w:p>
@@ -11519,7 +12304,7 @@
           <w:szCs w:val="22"/>
           <w:lang w:val="es-AR"/>
         </w:rPr>
-        <w:t xml:space="preserve"> No competimos con el sistema de una ciudad grande: llevamos su modelo, como servicio, a los municipios que no pueden construirlo, y nos integramos con el que ya existe. El diferencial es </w:t>
+        <w:t xml:space="preserve"> Llevamos como servicio el modelo de una ciudad grande a los municipios que no pueden construirlo, y nos integramos con el que ya existe. El diferencial es </w:t>
       </w:r>
       <w:r>
         <w:rPr>
@@ -11541,7 +12326,7 @@
           <w:szCs w:val="22"/>
           <w:lang w:val="es-AR"/>
         </w:rPr>
-        <w:t xml:space="preserve">: municipio y prestadoras en la misma red. Cada nuevo cliente vuelve más valiosa la plataforma para los demás, y la base de datos de reclamos y tiempos que se acumula es difícil de copiar. Además, cumple con la agenda de ciudad inteligente que piden los gobiernos locales: transparencia, datos abiertos y planificación urbana.</w:t>
+        <w:t xml:space="preserve">: municipio y prestadoras en una misma red, que gana valor con cada cliente y acumula datos difíciles de copiar. Responde a la agenda de ciudad inteligente: transparencia, datos abiertos y planificación urbana.</w:t>
       </w:r>
     </w:p>
     <w:p>
@@ -11559,7 +12344,7 @@
           <w:szCs w:val="22"/>
           <w:lang w:val="es-AR"/>
         </w:rPr>
-        <w:t xml:space="preserve">Clientes y canales.</w:t>
+        <w:t xml:space="preserve">Clientes e ingresos.</w:t>
       </w:r>
       <w:r>
         <w:rPr>
@@ -11569,7 +12354,29 @@
           <w:szCs w:val="22"/>
           <w:lang w:val="es-AR"/>
         </w:rPr>
-        <w:t xml:space="preserve"> Pagan los municipios medianos del Gran Rosario y de la provincia y las prestadoras de servicios en la vía pública. El vecino lo usa gratis. Vendemos de forma directa, con un piloto de 90 días como puerta de entrada, y el propio municipio invita a las prestadoras de su territorio.</w:t>
+        <w:t xml:space="preserve"> Pagan los municipios, con una suscripción por tramo de habitantes (USD 600 a 2.200 por mes) y USD 2.500 de implementación, y las prestadoras, con una licencia de USD 35 por cuadrilla por mes; se suman informes de datos a medida. El vecino lo usa gratis y no hay publicidad. Vendemos de forma directa, con un piloto de 90 días como puerta de entrada, y el municipio invita a las prestadoras de su territorio. Con 14 municipios y 280 cuadrillas, el año 3 cierra en </w:t>
+      </w:r>
+      <w:r>
+        <w:rPr>
+          <w:rFonts w:ascii="Lexend" w:cs="Lexend" w:eastAsia="Lexend" w:hAnsi="Lexend"/>
+          <w:b/>
+          <w:bCs/>
+          <w:color w:val="1A1A1A"/>
+          <w:sz w:val="22"/>
+          <w:szCs w:val="22"/>
+          <w:lang w:val="es-AR"/>
+        </w:rPr>
+        <w:t xml:space="preserve">USD 336.600</w:t>
+      </w:r>
+      <w:r>
+        <w:rPr>
+          <w:rFonts w:ascii="Lexend" w:cs="Lexend" w:eastAsia="Lexend" w:hAnsi="Lexend"/>
+          <w:color w:val="1A1A1A"/>
+          <w:sz w:val="22"/>
+          <w:szCs w:val="22"/>
+          <w:lang w:val="es-AR"/>
+        </w:rPr>
+        <w:t xml:space="preserve">: 54% suscripciones, 35% licencias, 11% datos e implementación.</w:t>
       </w:r>
     </w:p>
     <w:p>
@@ -11587,7 +12394,7 @@
           <w:szCs w:val="22"/>
           <w:lang w:val="es-AR"/>
         </w:rPr>
-        <w:t xml:space="preserve">Cómo gana dinero.</w:t>
+        <w:t xml:space="preserve">Cómo se lleva a cabo.</w:t>
       </w:r>
       <w:r>
         <w:rPr>
@@ -11597,29 +12404,7 @@
           <w:szCs w:val="22"/>
           <w:lang w:val="es-AR"/>
         </w:rPr>
-        <w:t xml:space="preserve"> Suscripción municipal por tramo de habitantes (USD 600 a 2.200 por mes), licencia por cuadrilla para las prestadoras (USD 35 por mes), implementación (USD 2.500 por única vez) e informes de datos a medida. Con 14 municipios y 280 cuadrillas al año 3, el ingreso anual proyectado es de </w:t>
-      </w:r>
-      <w:r>
-        <w:rPr>
-          <w:rFonts w:ascii="Lexend" w:cs="Lexend" w:eastAsia="Lexend" w:hAnsi="Lexend"/>
-          <w:b/>
-          <w:bCs/>
-          <w:color w:val="1A1A1A"/>
-          <w:sz w:val="22"/>
-          <w:szCs w:val="22"/>
-          <w:lang w:val="es-AR"/>
-        </w:rPr>
-        <w:t xml:space="preserve">USD 336.600</w:t>
-      </w:r>
-      <w:r>
-        <w:rPr>
-          <w:rFonts w:ascii="Lexend" w:cs="Lexend" w:eastAsia="Lexend" w:hAnsi="Lexend"/>
-          <w:color w:val="1A1A1A"/>
-          <w:sz w:val="22"/>
-          <w:szCs w:val="22"/>
-          <w:lang w:val="es-AR"/>
-        </w:rPr>
-        <w:t xml:space="preserve">: 54% suscripciones, 35% licencias, 11% datos e implementación. Sin publicidad.</w:t>
+        <w:t xml:space="preserve"> Operamos con software, datos y personas, sin hardware en la calle: USD 5.500 de costos fijos por mes con el retiro de los socios, y equilibrio con unos seis municipios durante el año 2. Empezamos con un MVP de 90 días en un municipio piloto, con ruteo manual, para validar cinco hipótesis antes de automatizar, con el Polo Tecnológico Rosario, BCR Innova, la UTN FRRo y una prestadora local.</w:t>
       </w:r>
     </w:p>
     <w:p>
@@ -11637,7 +12422,7 @@
           <w:szCs w:val="22"/>
           <w:lang w:val="es-AR"/>
         </w:rPr>
-        <w:t xml:space="preserve">Cómo se lleva a cabo.</w:t>
+        <w:t xml:space="preserve">El equipo.</w:t>
       </w:r>
       <w:r>
         <w:rPr>
@@ -11647,7 +12432,7 @@
           <w:szCs w:val="22"/>
           <w:lang w:val="es-AR"/>
         </w:rPr>
-        <w:t xml:space="preserve"> Lo que necesitamos para operar es software, datos y personas, sin hardware en la calle. Los costos fijos iniciales son de USD 5.500 por mes, sueldos de los fundadores incluidos. El equilibrio llega con unos seis municipios, durante el segundo año. El primer paso es un MVP de 90 días en un municipio piloto, con el ruteo hecho a mano por el equipo, para validar cinco hipótesis medibles antes de automatizar. Lo hacemos de la mano del Polo Tecnológico Rosario, BCR Innova, la UTN FRRo y una primera prestadora con cuadrillas en la zona.</w:t>
+        <w:t xml:space="preserve"> Cinco cofundadores, estudiantes avanzados de Ingeniería en Sistemas de la UTN FRRo, que ya planificaron una plataforma de órdenes de trabajo con app de campo para una empresa de telecomunicaciones. Cada uno lleva un frente y una hipótesis del piloto: dirección y municipios, prestadoras y alianzas, tecnología, producto y datos, y operaciones. El pacto de socios consolida sus acciones en cuatro años.</w:t>
       </w:r>
     </w:p>
     <w:p>
@@ -11660,172 +12445,66 @@
           <w:rFonts w:ascii="Lexend" w:cs="Lexend" w:eastAsia="Lexend" w:hAnsi="Lexend"/>
           <w:b/>
           <w:bCs/>
-          <w:i/>
-          <w:iCs/>
-          <w:color w:val="B00020"/>
+          <w:color w:val="1A1A1A"/>
           <w:sz w:val="22"/>
           <w:szCs w:val="22"/>
           <w:lang w:val="es-AR"/>
         </w:rPr>
-        <w:t xml:space="preserve">El equipo.</w:t>
-      </w:r>
-      <w:r>
-        <w:rPr>
-          <w:rFonts w:ascii="Lexend" w:cs="Lexend" w:eastAsia="Lexend" w:hAnsi="Lexend"/>
-          <w:i/>
-          <w:iCs/>
-          <w:color w:val="B00020"/>
+        <w:t xml:space="preserve">Qué pedimos.</w:t>
+      </w:r>
+      <w:r>
+        <w:rPr>
+          <w:rFonts w:ascii="Lexend" w:cs="Lexend" w:eastAsia="Lexend" w:hAnsi="Lexend"/>
+          <w:color w:val="1A1A1A"/>
           <w:sz w:val="22"/>
           <w:szCs w:val="22"/>
           <w:lang w:val="es-AR"/>
         </w:rPr>
-        <w:t xml:space="preserve"> Cinco cofundadores, estudiantes avanzados de Ingeniería en Sistemas de Información de la UTN FRRo, con experiencia en el análisis de procesos, la gestión de riesgos y la planificación de una plataforma de órdenes de trabajo para una empresa de telecomunicaciones. Roles: dirección y venta institucional, tecnología, producto y experiencia de usuario, datos, e implementación ⚠ </w:t>
-      </w:r>
-      <w:r>
-        <w:rPr>
-          <w:rFonts w:ascii="Lexend" w:cs="Lexend" w:eastAsia="Lexend" w:hAnsi="Lexend"/>
-          <w:i/>
-          <w:iCs/>
-          <w:color w:val="B00020"/>
+        <w:t xml:space="preserve"> </w:t>
+      </w:r>
+      <w:r>
+        <w:rPr>
+          <w:rFonts w:ascii="Lexend" w:cs="Lexend" w:eastAsia="Lexend" w:hAnsi="Lexend"/>
+          <w:b/>
+          <w:bCs/>
+          <w:color w:val="1A1A1A"/>
           <w:sz w:val="22"/>
           <w:szCs w:val="22"/>
           <w:lang w:val="es-AR"/>
         </w:rPr>
-        <w:t xml:space="preserve">(asignación a definir por el grupo)</w:t>
-      </w:r>
-      <w:r>
-        <w:rPr>
-          <w:rFonts w:ascii="Lexend" w:cs="Lexend" w:eastAsia="Lexend" w:hAnsi="Lexend"/>
-          <w:i/>
-          <w:iCs/>
-          <w:color w:val="B00020"/>
+        <w:t xml:space="preserve">USD 70.000</w:t>
+      </w:r>
+      <w:r>
+        <w:rPr>
+          <w:rFonts w:ascii="Lexend" w:cs="Lexend" w:eastAsia="Lexend" w:hAnsi="Lexend"/>
+          <w:color w:val="1A1A1A"/>
           <w:sz w:val="22"/>
           <w:szCs w:val="22"/>
           <w:lang w:val="es-AR"/>
         </w:rPr>
-        <w:t xml:space="preserve">.</w:t>
-      </w:r>
-    </w:p>
-    <w:p>
-      <w:pPr>
-        <w:spacing w:after="120" w:line="280"/>
-        <w:jc w:val="both"/>
-      </w:pPr>
+        <w:t xml:space="preserve"> para 18 meses: 60% producto y equipo, 25% piloto y venta, 15% reserva. A cambio, el </w:t>
+      </w:r>
       <w:r>
         <w:rPr>
           <w:rFonts w:ascii="Lexend" w:cs="Lexend" w:eastAsia="Lexend" w:hAnsi="Lexend"/>
           <w:b/>
           <w:bCs/>
-          <w:i/>
-          <w:iCs/>
-          <w:color w:val="B00020"/>
+          <w:color w:val="1A1A1A"/>
           <w:sz w:val="22"/>
           <w:szCs w:val="22"/>
           <w:lang w:val="es-AR"/>
         </w:rPr>
-        <w:t xml:space="preserve">Qué pedimos.</w:t>
-      </w:r>
-      <w:r>
-        <w:rPr>
-          <w:rFonts w:ascii="Lexend" w:cs="Lexend" w:eastAsia="Lexend" w:hAnsi="Lexend"/>
-          <w:i/>
-          <w:iCs/>
-          <w:color w:val="B00020"/>
+        <w:t xml:space="preserve">20% de la SAS</w:t>
+      </w:r>
+      <w:r>
+        <w:rPr>
+          <w:rFonts w:ascii="Lexend" w:cs="Lexend" w:eastAsia="Lexend" w:hAnsi="Lexend"/>
+          <w:color w:val="1A1A1A"/>
           <w:sz w:val="22"/>
           <w:szCs w:val="22"/>
           <w:lang w:val="es-AR"/>
         </w:rPr>
-        <w:t xml:space="preserve"> </w:t>
-      </w:r>
-      <w:r>
-        <w:rPr>
-          <w:rFonts w:ascii="Lexend" w:cs="Lexend" w:eastAsia="Lexend" w:hAnsi="Lexend"/>
-          <w:b/>
-          <w:bCs/>
-          <w:i/>
-          <w:iCs/>
-          <w:color w:val="B00020"/>
-          <w:sz w:val="22"/>
-          <w:szCs w:val="22"/>
-          <w:lang w:val="es-AR"/>
-        </w:rPr>
-        <w:t xml:space="preserve">USD 70.000</w:t>
-      </w:r>
-      <w:r>
-        <w:rPr>
-          <w:rFonts w:ascii="Lexend" w:cs="Lexend" w:eastAsia="Lexend" w:hAnsi="Lexend"/>
-          <w:i/>
-          <w:iCs/>
-          <w:color w:val="B00020"/>
-          <w:sz w:val="22"/>
-          <w:szCs w:val="22"/>
-          <w:lang w:val="es-AR"/>
-        </w:rPr>
-        <w:t xml:space="preserve"> para 18 meses de operación: el 60% para producto y equipo, el 25% para el piloto y la venta, y el 15% como reserva. A cambio ofrecemos el </w:t>
-      </w:r>
-      <w:r>
-        <w:rPr>
-          <w:rFonts w:ascii="Lexend" w:cs="Lexend" w:eastAsia="Lexend" w:hAnsi="Lexend"/>
-          <w:b/>
-          <w:bCs/>
-          <w:i/>
-          <w:iCs/>
-          <w:color w:val="B00020"/>
-          <w:sz w:val="22"/>
-          <w:szCs w:val="22"/>
-          <w:lang w:val="es-AR"/>
-        </w:rPr>
-        <w:t xml:space="preserve">12% de la SAS</w:t>
-      </w:r>
-      <w:r>
-        <w:rPr>
-          <w:rFonts w:ascii="Lexend" w:cs="Lexend" w:eastAsia="Lexend" w:hAnsi="Lexend"/>
-          <w:i/>
-          <w:iCs/>
-          <w:color w:val="B00020"/>
-          <w:sz w:val="22"/>
-          <w:szCs w:val="22"/>
-          <w:lang w:val="es-AR"/>
-        </w:rPr>
-        <w:t xml:space="preserve"> ⚠ </w:t>
-      </w:r>
-      <w:r>
-        <w:rPr>
-          <w:rFonts w:ascii="Lexend" w:cs="Lexend" w:eastAsia="Lexend" w:hAnsi="Lexend"/>
-          <w:i/>
-          <w:iCs/>
-          <w:color w:val="B00020"/>
-          <w:sz w:val="22"/>
-          <w:szCs w:val="22"/>
-          <w:lang w:val="es-AR"/>
-        </w:rPr>
-        <w:t xml:space="preserve">(propuesta inicial)</w:t>
-      </w:r>
-      <w:r>
-        <w:rPr>
-          <w:rFonts w:ascii="Lexend" w:cs="Lexend" w:eastAsia="Lexend" w:hAnsi="Lexend"/>
-          <w:i/>
-          <w:iCs/>
-          <w:color w:val="B00020"/>
-          <w:sz w:val="22"/>
-          <w:szCs w:val="22"/>
-          <w:lang w:val="es-AR"/>
-        </w:rPr>
-        <w:t xml:space="preserve">, y lo complementamos con aportes no reembolsables de los programas de emprendedores. El hito que el inversor puede medir: </w:t>
-      </w:r>
-      <w:r>
-        <w:rPr>
-          <w:rFonts w:ascii="Lexend" w:cs="Lexend" w:eastAsia="Lexend" w:hAnsi="Lexend"/>
-          <w:b/>
-          <w:bCs/>
-          <w:i/>
-          <w:iCs/>
-          <w:color w:val="B00020"/>
-          <w:sz w:val="22"/>
-          <w:szCs w:val="22"/>
-          <w:lang w:val="es-AR"/>
-        </w:rPr>
-        <w:t xml:space="preserve">municipio piloto pagando al mes 6 y punto de equilibrio en el año 2.</w:t>
+        <w:t xml:space="preserve"> en dos desembolsos de USD 35.000 por el 10% cada uno: el primero financia el piloto y el segundo se libera cuando el municipio firma la suscripción, al mes 6. Si el piloto falla, el inversor arriesgó la mitad. Se suman aportes no reembolsables de programas públicos.</w:t>
       </w:r>
     </w:p>
     <w:sectPr>

</xml_diff>

<commit_message>
ASI: etapa 4 — tributos en la estructura de costos, precios sin iva y punto de equilibrio recalculado (doc + canvas)
Co-Authored-By: Claude Opus 5.5 <noreply@anthropic.com>
</commit_message>
<xml_diff>
--- a/materias/ASI/entregables/etapa4.docx
+++ b/materias/ASI/entregables/etapa4.docx
@@ -635,6 +635,132 @@
           </w:tcPr>
           <w:p>
             <w:pPr>
+              <w:keepNext/>
+              <w:suppressAutoHyphens/>
+              <w:spacing w:after="0" w:before="0" w:line="252"/>
+              <w:jc w:val="left"/>
+            </w:pPr>
+            <w:r>
+              <w:rPr>
+                <w:rFonts w:ascii="Lexend" w:cs="Lexend" w:eastAsia="Lexend" w:hAnsi="Lexend"/>
+                <w:color w:val="1A1A1A"/>
+                <w:sz w:val="18"/>
+                <w:szCs w:val="18"/>
+                <w:lang w:val="es-AR"/>
+              </w:rPr>
+              <w:t xml:space="preserve">2</w:t>
+            </w:r>
+          </w:p>
+        </w:tc>
+        <w:tc>
+          <w:tcPr>
+            <w:tcW w:type="dxa" w:w="1253"/>
+            <w:tcMar>
+              <w:top w:type="dxa" w:w="90"/>
+              <w:left w:type="dxa" w:w="120"/>
+              <w:bottom w:type="dxa" w:w="90"/>
+              <w:right w:type="dxa" w:w="120"/>
+            </w:tcMar>
+            <w:vAlign w:val="top"/>
+          </w:tcPr>
+          <w:p>
+            <w:pPr>
+              <w:keepNext/>
+              <w:suppressAutoHyphens/>
+              <w:spacing w:after="0" w:before="0" w:line="252"/>
+              <w:jc w:val="left"/>
+            </w:pPr>
+            <w:r>
+              <w:rPr>
+                <w:rFonts w:ascii="Lexend" w:cs="Lexend" w:eastAsia="Lexend" w:hAnsi="Lexend"/>
+                <w:color w:val="1A1A1A"/>
+                <w:sz w:val="18"/>
+                <w:szCs w:val="18"/>
+                <w:lang w:val="es-AR"/>
+              </w:rPr>
+              <w:t xml:space="preserve">20/10/2026</w:t>
+            </w:r>
+          </w:p>
+        </w:tc>
+        <w:tc>
+          <w:tcPr>
+            <w:tcW w:type="dxa" w:w="1253"/>
+            <w:tcMar>
+              <w:top w:type="dxa" w:w="90"/>
+              <w:left w:type="dxa" w:w="120"/>
+              <w:bottom w:type="dxa" w:w="90"/>
+              <w:right w:type="dxa" w:w="120"/>
+            </w:tcMar>
+            <w:vAlign w:val="top"/>
+          </w:tcPr>
+          <w:p>
+            <w:pPr>
+              <w:keepNext/>
+              <w:suppressAutoHyphens/>
+              <w:spacing w:after="0" w:before="0" w:line="252"/>
+              <w:jc w:val="left"/>
+            </w:pPr>
+            <w:r>
+              <w:rPr>
+                <w:rFonts w:ascii="Lexend" w:cs="Lexend" w:eastAsia="Lexend" w:hAnsi="Lexend"/>
+                <w:color w:val="1A1A1A"/>
+                <w:sz w:val="18"/>
+                <w:szCs w:val="18"/>
+                <w:lang w:val="es-AR"/>
+              </w:rPr>
+              <w:t xml:space="preserve">Grupo N310</w:t>
+            </w:r>
+          </w:p>
+        </w:tc>
+        <w:tc>
+          <w:tcPr>
+            <w:tcW w:type="dxa" w:w="6361"/>
+            <w:tcMar>
+              <w:top w:type="dxa" w:w="90"/>
+              <w:left w:type="dxa" w:w="120"/>
+              <w:bottom w:type="dxa" w:w="90"/>
+              <w:right w:type="dxa" w:w="120"/>
+            </w:tcMar>
+            <w:vAlign w:val="top"/>
+          </w:tcPr>
+          <w:p>
+            <w:pPr>
+              <w:keepNext/>
+              <w:suppressAutoHyphens/>
+              <w:spacing w:after="0" w:before="0" w:line="252"/>
+              <w:jc w:val="left"/>
+            </w:pPr>
+            <w:r>
+              <w:rPr>
+                <w:rFonts w:ascii="Lexend" w:cs="Lexend" w:eastAsia="Lexend" w:hAnsi="Lexend"/>
+                <w:color w:val="1A1A1A"/>
+                <w:sz w:val="18"/>
+                <w:szCs w:val="18"/>
+                <w:lang w:val="es-AR"/>
+              </w:rPr>
+              <w:t xml:space="preserve">Equipo fundador con un rol y una hipótesis del MVP por cofundador; pacto de socios con consolidación gradual de acciones; participación ofrecida al inversor, en dos tramos atados al piloto; resumen para el inversor ajustado a una página</w:t>
+            </w:r>
+          </w:p>
+        </w:tc>
+      </w:tr>
+      <w:tr>
+        <w:trPr>
+          <w:cantSplit/>
+          <w:tblHeader w:val="false"/>
+        </w:trPr>
+        <w:tc>
+          <w:tcPr>
+            <w:tcW w:type="dxa" w:w="771"/>
+            <w:tcMar>
+              <w:top w:type="dxa" w:w="90"/>
+              <w:left w:type="dxa" w:w="120"/>
+              <w:bottom w:type="dxa" w:w="90"/>
+              <w:right w:type="dxa" w:w="120"/>
+            </w:tcMar>
+            <w:vAlign w:val="top"/>
+          </w:tcPr>
+          <w:p>
+            <w:pPr>
               <w:keepNext w:val="false"/>
               <w:suppressAutoHyphens/>
               <w:spacing w:after="0" w:before="0" w:line="252"/>
@@ -648,7 +774,7 @@
                 <w:szCs w:val="18"/>
                 <w:lang w:val="es-AR"/>
               </w:rPr>
-              <w:t xml:space="preserve">2</w:t>
+              <w:t xml:space="preserve">3</w:t>
             </w:r>
           </w:p>
         </w:tc>
@@ -678,7 +804,7 @@
                 <w:szCs w:val="18"/>
                 <w:lang w:val="es-AR"/>
               </w:rPr>
-              <w:t xml:space="preserve">20/10/2026</w:t>
+              <w:t xml:space="preserve">23/10/2026</w:t>
             </w:r>
           </w:p>
         </w:tc>
@@ -738,7 +864,7 @@
                 <w:szCs w:val="18"/>
                 <w:lang w:val="es-AR"/>
               </w:rPr>
-              <w:t xml:space="preserve">Equipo fundador con un rol y una hipótesis del MVP por cofundador; pacto de socios con consolidación gradual de acciones; participación ofrecida al inversor, en dos tramos atados al piloto; resumen para el inversor ajustado a una página</w:t>
+              <w:t xml:space="preserve">Tributos en la estructura de costos y punto de equilibrio recalculado; precios expresados sin IVA</w:t>
             </w:r>
           </w:p>
         </w:tc>
@@ -7547,7 +7673,7 @@
           <w:szCs w:val="22"/>
           <w:lang w:val="es-AR"/>
         </w:rPr>
-        <w:t xml:space="preserve">Los precios se fijan en dólares porque el principal costo, la infraestructura en la nube, se paga en dólares. Se cobran en pesos al tipo de cambio oficial, con ajuste trimestral.</w:t>
+        <w:t xml:space="preserve">Los precios se fijan en dólares porque el principal costo, la infraestructura en la nube, se paga en dólares. Se cobran en pesos al tipo de cambio oficial, con ajuste trimestral, y se expresan sin IVA. Para las prestadoras, que son responsables inscriptas, el IVA es neutro. El municipio, en cambio, es un sujeto exento que no puede descontarlo, así que paga el 21% por encima del precio de lista.</w:t>
       </w:r>
     </w:p>
     <w:p>
@@ -12029,6 +12155,72 @@
           </w:tcPr>
           <w:p>
             <w:pPr>
+              <w:keepNext/>
+              <w:suppressAutoHyphens/>
+              <w:spacing w:after="0" w:before="0" w:line="252"/>
+              <w:jc w:val="left"/>
+            </w:pPr>
+            <w:r>
+              <w:rPr>
+                <w:rFonts w:ascii="Lexend" w:cs="Lexend" w:eastAsia="Lexend" w:hAnsi="Lexend"/>
+                <w:color w:val="1A1A1A"/>
+                <w:sz w:val="18"/>
+                <w:szCs w:val="18"/>
+                <w:lang w:val="es-AR"/>
+              </w:rPr>
+              <w:t xml:space="preserve">Por cuadrilla: almacenamiento de fotos y notificaciones</w:t>
+            </w:r>
+          </w:p>
+        </w:tc>
+        <w:tc>
+          <w:tcPr>
+            <w:tcW w:type="dxa" w:w="3855"/>
+            <w:tcMar>
+              <w:top w:type="dxa" w:w="90"/>
+              <w:left w:type="dxa" w:w="120"/>
+              <w:bottom w:type="dxa" w:w="90"/>
+              <w:right w:type="dxa" w:w="120"/>
+            </w:tcMar>
+            <w:vAlign w:val="top"/>
+          </w:tcPr>
+          <w:p>
+            <w:pPr>
+              <w:keepNext/>
+              <w:suppressAutoHyphens/>
+              <w:spacing w:after="0" w:before="0" w:line="252"/>
+              <w:jc w:val="left"/>
+            </w:pPr>
+            <w:r>
+              <w:rPr>
+                <w:rFonts w:ascii="Lexend" w:cs="Lexend" w:eastAsia="Lexend" w:hAnsi="Lexend"/>
+                <w:color w:val="1A1A1A"/>
+                <w:sz w:val="18"/>
+                <w:szCs w:val="18"/>
+                <w:lang w:val="es-AR"/>
+              </w:rPr>
+              <w:t xml:space="preserve">USD 4 por mes</w:t>
+            </w:r>
+          </w:p>
+        </w:tc>
+      </w:tr>
+      <w:tr>
+        <w:trPr>
+          <w:cantSplit/>
+          <w:tblHeader w:val="false"/>
+        </w:trPr>
+        <w:tc>
+          <w:tcPr>
+            <w:tcW w:type="dxa" w:w="5783"/>
+            <w:tcMar>
+              <w:top w:type="dxa" w:w="90"/>
+              <w:left w:type="dxa" w:w="120"/>
+              <w:bottom w:type="dxa" w:w="90"/>
+              <w:right w:type="dxa" w:w="120"/>
+            </w:tcMar>
+            <w:vAlign w:val="top"/>
+          </w:tcPr>
+          <w:p>
+            <w:pPr>
               <w:keepNext w:val="false"/>
               <w:suppressAutoHyphens/>
               <w:spacing w:after="0" w:before="0" w:line="252"/>
@@ -12042,7 +12234,7 @@
                 <w:szCs w:val="18"/>
                 <w:lang w:val="es-AR"/>
               </w:rPr>
-              <w:t xml:space="preserve">Por cuadrilla: almacenamiento de fotos y notificaciones</w:t>
+              <w:t xml:space="preserve">Tributos sobre la facturación: Ingresos Brutos, Derecho de Registro e Inspección e impuesto a los débitos y créditos bancarios</w:t>
             </w:r>
           </w:p>
         </w:tc>
@@ -12072,7 +12264,7 @@
                 <w:szCs w:val="18"/>
                 <w:lang w:val="es-AR"/>
               </w:rPr>
-              <w:t xml:space="preserve">USD 4 por mes</w:t>
+              <w:t xml:space="preserve">5% de lo facturado</w:t>
             </w:r>
           </w:p>
         </w:tc>
@@ -12098,7 +12290,7 @@
           <w:szCs w:val="22"/>
           <w:lang w:val="es-AR"/>
         </w:rPr>
-        <w:t xml:space="preserve">Punto de equilibrio.</w:t>
+        <w:t xml:space="preserve">Tributos.</w:t>
       </w:r>
       <w:r>
         <w:rPr>
@@ -12108,7 +12300,29 @@
           <w:szCs w:val="22"/>
           <w:lang w:val="es-AR"/>
         </w:rPr>
-        <w:t xml:space="preserve"> Como hace la cátedra en su ejemplo, el retiro de los socios va dentro de los costos fijos. Para un municipio de hasta 100.000 habitantes:</w:t>
+        <w:t xml:space="preserve"> La cátedra incluye los impuestos entre los costos variables. Por eso se suman los que se pagan sobre la facturación: Ingresos Brutos (provincial), Derecho de Registro e Inspección (municipal) e impuesto a los débitos y créditos bancarios. En conjunto se estiman en un 5% de lo facturado </w:t>
+      </w:r>
+      <w:r>
+        <w:rPr>
+          <w:rFonts w:ascii="Lexend" w:cs="Lexend" w:eastAsia="Lexend" w:hAnsi="Lexend"/>
+          <w:i/>
+          <w:iCs/>
+          <w:color w:val="1A1A1A"/>
+          <w:sz w:val="22"/>
+          <w:szCs w:val="22"/>
+          <w:lang w:val="es-AR"/>
+        </w:rPr>
+        <w:t xml:space="preserve">(supuesto, a confirmar con un contador)</w:t>
+      </w:r>
+      <w:r>
+        <w:rPr>
+          <w:rFonts w:ascii="Lexend" w:cs="Lexend" w:eastAsia="Lexend" w:hAnsi="Lexend"/>
+          <w:color w:val="1A1A1A"/>
+          <w:sz w:val="22"/>
+          <w:szCs w:val="22"/>
+          <w:lang w:val="es-AR"/>
+        </w:rPr>
+        <w:t xml:space="preserve">. El IVA no es un costo de la empresa, porque lo cobra y lo deposita, y por eso los precios se expresan sin IVA. El impuesto a las Ganancias recae sobre la utilidad, de modo que no modifica el punto de equilibrio. Su alícuota se reduce si la empresa se inscribe en el régimen de la Ley de Economía del Conocimiento. Los dos empleados que se suman en el año 2 se costean con las cargas sociales y el aguinaldo incluidos, para perfiles junior.</w:t>
       </w:r>
     </w:p>
     <w:p>
@@ -12119,24 +12333,24 @@
       <w:r>
         <w:rPr>
           <w:rFonts w:ascii="Lexend" w:cs="Lexend" w:eastAsia="Lexend" w:hAnsi="Lexend"/>
+          <w:b/>
+          <w:bCs/>
           <w:color w:val="1A1A1A"/>
           <w:sz w:val="22"/>
           <w:szCs w:val="22"/>
           <w:lang w:val="es-AR"/>
         </w:rPr>
-        <w:t xml:space="preserve">Q = CF / (P − CVu) = 5.500 / (1.200 − 180) = 5.500 / 1.020 ≈ 5,4 → </w:t>
-      </w:r>
-      <w:r>
-        <w:rPr>
-          <w:rFonts w:ascii="Lexend" w:cs="Lexend" w:eastAsia="Lexend" w:hAnsi="Lexend"/>
-          <w:b/>
-          <w:bCs/>
+        <w:t xml:space="preserve">Punto de equilibrio.</w:t>
+      </w:r>
+      <w:r>
+        <w:rPr>
+          <w:rFonts w:ascii="Lexend" w:cs="Lexend" w:eastAsia="Lexend" w:hAnsi="Lexend"/>
           <w:color w:val="1A1A1A"/>
           <w:sz w:val="22"/>
           <w:szCs w:val="22"/>
           <w:lang w:val="es-AR"/>
         </w:rPr>
-        <w:t xml:space="preserve">6 municipios</w:t>
+        <w:t xml:space="preserve"> Como hace la cátedra en su ejemplo, el retiro de los socios va dentro de los costos fijos. Para un municipio de hasta 100.000 habitantes, el costo variable unitario suma los USD 180 de operación y USD 60 de tributos (5% de USD 1.200):</w:t>
       </w:r>
     </w:p>
     <w:p>
@@ -12152,7 +12366,7 @@
           <w:szCs w:val="22"/>
           <w:lang w:val="es-AR"/>
         </w:rPr>
-        <w:t xml:space="preserve">Con la mezcla de clientes proyectada, el margen de contribución al cierre del año 1 es de USD 2.790 por mes. Son USD 1.860 de los tres municipios y USD 930 de las 30 cuadrillas, la mitad de los costos fijos. </w:t>
+        <w:t xml:space="preserve">Q = CF / (P − CVu) = 5.500 / (1.200 − 180 − 60) = 5.500 / 960 ≈ 5,7 → </w:t>
       </w:r>
       <w:r>
         <w:rPr>
@@ -12164,8 +12378,14 @@
           <w:szCs w:val="22"/>
           <w:lang w:val="es-AR"/>
         </w:rPr>
-        <w:t xml:space="preserve">El equilibrio se alcanza durante el año 2.</w:t>
-      </w:r>
+        <w:t xml:space="preserve">6 municipios</w:t>
+      </w:r>
+    </w:p>
+    <w:p>
+      <w:pPr>
+        <w:spacing w:after="120" w:line="280"/>
+        <w:jc w:val="both"/>
+      </w:pPr>
       <w:r>
         <w:rPr>
           <w:rFonts w:ascii="Lexend" w:cs="Lexend" w:eastAsia="Lexend" w:hAnsi="Lexend"/>
@@ -12174,7 +12394,29 @@
           <w:szCs w:val="22"/>
           <w:lang w:val="es-AR"/>
         </w:rPr>
-        <w:t xml:space="preserve"> Al cierre de ese año, el margen de contribución (USD 10.880 por mes) cubre los costos fijos aun después de sumar al equipo el desarrollador y la persona de soporte, unos USD 8.000 por mes en total. La brecha del primer año y medio es la que cubre la inversión que se pide en el punto 3.</w:t>
+        <w:t xml:space="preserve">Con la mezcla de clientes proyectada y descontados los tributos, el margen de contribución al cierre del año 1 es de USD 2.620 por mes. Son USD 1.740 de los tres municipios y USD 880 de las 30 cuadrillas, casi la mitad de los costos fijos. </w:t>
+      </w:r>
+      <w:r>
+        <w:rPr>
+          <w:rFonts w:ascii="Lexend" w:cs="Lexend" w:eastAsia="Lexend" w:hAnsi="Lexend"/>
+          <w:b/>
+          <w:bCs/>
+          <w:color w:val="1A1A1A"/>
+          <w:sz w:val="22"/>
+          <w:szCs w:val="22"/>
+          <w:lang w:val="es-AR"/>
+        </w:rPr>
+        <w:t xml:space="preserve">El equilibrio se alcanza durante el año 2.</w:t>
+      </w:r>
+      <w:r>
+        <w:rPr>
+          <w:rFonts w:ascii="Lexend" w:cs="Lexend" w:eastAsia="Lexend" w:hAnsi="Lexend"/>
+          <w:color w:val="1A1A1A"/>
+          <w:sz w:val="22"/>
+          <w:szCs w:val="22"/>
+          <w:lang w:val="es-AR"/>
+        </w:rPr>
+        <w:t xml:space="preserve"> Al cierre de ese año, el margen de contribución (USD 10.240 por mes) cubre los costos fijos aun después de sumar al equipo el desarrollador y la persona de soporte, unos USD 8.000 por mes en total. La brecha del primer año y medio es la que cubre la inversión que se pide en el punto 3.</w:t>
       </w:r>
     </w:p>
     <w:p>

</xml_diff>

<commit_message>
ASI: etapa 4 — equipo de cuatro cofundadores (corrección del profe): roles unidos, retiro 4 × 1.000, carátula sin de la rosa
Co-Authored-By: Claude Opus 5.5 <noreply@anthropic.com>
</commit_message>
<xml_diff>
--- a/materias/ASI/entregables/etapa4.docx
+++ b/materias/ASI/entregables/etapa4.docx
@@ -249,27 +249,6 @@
           <w:lang w:val="es-AR"/>
         </w:rPr>
         <w:t xml:space="preserve">52674, Casermeiro Gonzalo, gonzacasermeiro@gmail.com</w:t>
-      </w:r>
-    </w:p>
-    <w:p>
-      <w:pPr>
-        <w:pStyle w:val="ListParagraph"/>
-        <w:numPr>
-          <w:ilvl w:val="0"/>
-          <w:numId w:val="1"/>
-        </w:numPr>
-        <w:spacing w:after="100" w:line="276"/>
-        <w:jc w:val="both"/>
-      </w:pPr>
-      <w:r>
-        <w:rPr>
-          <w:rFonts w:ascii="Lexend" w:cs="Lexend" w:eastAsia="Lexend" w:hAnsi="Lexend"/>
-          <w:color w:val="1A1A1A"/>
-          <w:sz w:val="22"/>
-          <w:szCs w:val="22"/>
-          <w:lang w:val="es-AR"/>
-        </w:rPr>
-        <w:t xml:space="preserve">53543, De la Rosa Valentín Yael, mferreyra079@gmail.com</w:t>
       </w:r>
     </w:p>
     <w:p>
@@ -761,6 +740,132 @@
           </w:tcPr>
           <w:p>
             <w:pPr>
+              <w:keepNext/>
+              <w:suppressAutoHyphens/>
+              <w:spacing w:after="0" w:before="0" w:line="252"/>
+              <w:jc w:val="left"/>
+            </w:pPr>
+            <w:r>
+              <w:rPr>
+                <w:rFonts w:ascii="Lexend" w:cs="Lexend" w:eastAsia="Lexend" w:hAnsi="Lexend"/>
+                <w:color w:val="1A1A1A"/>
+                <w:sz w:val="18"/>
+                <w:szCs w:val="18"/>
+                <w:lang w:val="es-AR"/>
+              </w:rPr>
+              <w:t xml:space="preserve">3</w:t>
+            </w:r>
+          </w:p>
+        </w:tc>
+        <w:tc>
+          <w:tcPr>
+            <w:tcW w:type="dxa" w:w="1253"/>
+            <w:tcMar>
+              <w:top w:type="dxa" w:w="90"/>
+              <w:left w:type="dxa" w:w="120"/>
+              <w:bottom w:type="dxa" w:w="90"/>
+              <w:right w:type="dxa" w:w="120"/>
+            </w:tcMar>
+            <w:vAlign w:val="top"/>
+          </w:tcPr>
+          <w:p>
+            <w:pPr>
+              <w:keepNext/>
+              <w:suppressAutoHyphens/>
+              <w:spacing w:after="0" w:before="0" w:line="252"/>
+              <w:jc w:val="left"/>
+            </w:pPr>
+            <w:r>
+              <w:rPr>
+                <w:rFonts w:ascii="Lexend" w:cs="Lexend" w:eastAsia="Lexend" w:hAnsi="Lexend"/>
+                <w:color w:val="1A1A1A"/>
+                <w:sz w:val="18"/>
+                <w:szCs w:val="18"/>
+                <w:lang w:val="es-AR"/>
+              </w:rPr>
+              <w:t xml:space="preserve">23/10/2026</w:t>
+            </w:r>
+          </w:p>
+        </w:tc>
+        <w:tc>
+          <w:tcPr>
+            <w:tcW w:type="dxa" w:w="1253"/>
+            <w:tcMar>
+              <w:top w:type="dxa" w:w="90"/>
+              <w:left w:type="dxa" w:w="120"/>
+              <w:bottom w:type="dxa" w:w="90"/>
+              <w:right w:type="dxa" w:w="120"/>
+            </w:tcMar>
+            <w:vAlign w:val="top"/>
+          </w:tcPr>
+          <w:p>
+            <w:pPr>
+              <w:keepNext/>
+              <w:suppressAutoHyphens/>
+              <w:spacing w:after="0" w:before="0" w:line="252"/>
+              <w:jc w:val="left"/>
+            </w:pPr>
+            <w:r>
+              <w:rPr>
+                <w:rFonts w:ascii="Lexend" w:cs="Lexend" w:eastAsia="Lexend" w:hAnsi="Lexend"/>
+                <w:color w:val="1A1A1A"/>
+                <w:sz w:val="18"/>
+                <w:szCs w:val="18"/>
+                <w:lang w:val="es-AR"/>
+              </w:rPr>
+              <w:t xml:space="preserve">Grupo N310</w:t>
+            </w:r>
+          </w:p>
+        </w:tc>
+        <w:tc>
+          <w:tcPr>
+            <w:tcW w:type="dxa" w:w="6361"/>
+            <w:tcMar>
+              <w:top w:type="dxa" w:w="90"/>
+              <w:left w:type="dxa" w:w="120"/>
+              <w:bottom w:type="dxa" w:w="90"/>
+              <w:right w:type="dxa" w:w="120"/>
+            </w:tcMar>
+            <w:vAlign w:val="top"/>
+          </w:tcPr>
+          <w:p>
+            <w:pPr>
+              <w:keepNext/>
+              <w:suppressAutoHyphens/>
+              <w:spacing w:after="0" w:before="0" w:line="252"/>
+              <w:jc w:val="left"/>
+            </w:pPr>
+            <w:r>
+              <w:rPr>
+                <w:rFonts w:ascii="Lexend" w:cs="Lexend" w:eastAsia="Lexend" w:hAnsi="Lexend"/>
+                <w:color w:val="1A1A1A"/>
+                <w:sz w:val="18"/>
+                <w:szCs w:val="18"/>
+                <w:lang w:val="es-AR"/>
+              </w:rPr>
+              <w:t xml:space="preserve">Tributos en la estructura de costos y punto de equilibrio recalculado; precios expresados sin IVA</w:t>
+            </w:r>
+          </w:p>
+        </w:tc>
+      </w:tr>
+      <w:tr>
+        <w:trPr>
+          <w:cantSplit/>
+          <w:tblHeader w:val="false"/>
+        </w:trPr>
+        <w:tc>
+          <w:tcPr>
+            <w:tcW w:type="dxa" w:w="771"/>
+            <w:tcMar>
+              <w:top w:type="dxa" w:w="90"/>
+              <w:left w:type="dxa" w:w="120"/>
+              <w:bottom w:type="dxa" w:w="90"/>
+              <w:right w:type="dxa" w:w="120"/>
+            </w:tcMar>
+            <w:vAlign w:val="top"/>
+          </w:tcPr>
+          <w:p>
+            <w:pPr>
               <w:keepNext w:val="false"/>
               <w:suppressAutoHyphens/>
               <w:spacing w:after="0" w:before="0" w:line="252"/>
@@ -774,7 +879,7 @@
                 <w:szCs w:val="18"/>
                 <w:lang w:val="es-AR"/>
               </w:rPr>
-              <w:t xml:space="preserve">3</w:t>
+              <w:t xml:space="preserve">4</w:t>
             </w:r>
           </w:p>
         </w:tc>
@@ -804,7 +909,7 @@
                 <w:szCs w:val="18"/>
                 <w:lang w:val="es-AR"/>
               </w:rPr>
-              <w:t xml:space="preserve">23/10/2026</w:t>
+              <w:t xml:space="preserve">25/10/2026</w:t>
             </w:r>
           </w:p>
         </w:tc>
@@ -864,7 +969,7 @@
                 <w:szCs w:val="18"/>
                 <w:lang w:val="es-AR"/>
               </w:rPr>
-              <w:t xml:space="preserve">Tributos en la estructura de costos y punto de equilibrio recalculado; precios expresados sin IVA</w:t>
+              <w:t xml:space="preserve">Equipo fundador de cuatro cofundadores, en línea con la carátula: producto y operaciones se unen en un solo rol y el retiro se reparte entre cuatro</w:t>
             </w:r>
           </w:p>
         </w:tc>
@@ -4071,7 +4176,7 @@
                 <w:szCs w:val="18"/>
                 <w:lang w:val="es-AR"/>
               </w:rPr>
-              <w:t xml:space="preserve">Pacto de socios en la constitución de la SAS: un rol y una hipótesis del MVP por cofundador (punto 2.6), dedicación y salida. Las acciones de cada cofundador se consolidan de forma gradual en cuatro años, con un mínimo de uno (</w:t>
+              <w:t xml:space="preserve">Pacto de socios en la constitución de la SAS: un rol por cofundador, responsable de una o dos hipótesis del MVP (punto 2.6), dedicación y salida. Las acciones de cada cofundador se consolidan de forma gradual en cuatro años, con un mínimo de uno (</w:t>
             </w:r>
             <w:r>
               <w:rPr>
@@ -9532,7 +9637,7 @@
                 <w:szCs w:val="18"/>
                 <w:lang w:val="es-AR"/>
               </w:rPr>
-              <w:t xml:space="preserve">Los cinco cofundadores, estudiantes avanzados de Ingeniería en Sistemas, con un frente y una hipótesis del MVP cada uno (tabla siguiente); a partir del año 2, un desarrollador, que se suma a tecnología, y una persona de implementación y soporte, que se suma a operaciones</w:t>
+              <w:t xml:space="preserve">Los cuatro cofundadores, estudiantes avanzados de Ingeniería en Sistemas, con un frente y al menos una hipótesis del MVP cada uno (tabla siguiente); a partir del año 2, un desarrollador, que se suma a tecnología, y una persona de implementación y soporte, que se suma a producto y operaciones</w:t>
             </w:r>
           </w:p>
         </w:tc>
@@ -9700,7 +9805,7 @@
           <w:szCs w:val="22"/>
           <w:lang w:val="es-AR"/>
         </w:rPr>
-        <w:t xml:space="preserve"> Cada cofundador lleva un frente del negocio y responde por una de las hipótesis del MVP (punto 1), de modo que cada resultado del piloto tiene un responsable.</w:t>
+        <w:t xml:space="preserve"> Cada cofundador lleva un frente del negocio y responde por una o dos de las hipótesis del MVP (punto 1), de modo que cada resultado del piloto tiene un responsable.</w:t>
       </w:r>
     </w:p>
     <w:tbl>
@@ -10132,20 +10237,20 @@
           </w:tcPr>
           <w:p>
             <w:pPr>
-              <w:keepNext/>
-              <w:suppressAutoHyphens/>
-              <w:spacing w:after="0" w:before="0" w:line="252"/>
-              <w:jc w:val="left"/>
-            </w:pPr>
-            <w:r>
-              <w:rPr>
-                <w:rFonts w:ascii="Lexend" w:cs="Lexend" w:eastAsia="Lexend" w:hAnsi="Lexend"/>
-                <w:color w:val="1A1A1A"/>
-                <w:sz w:val="18"/>
-                <w:szCs w:val="18"/>
-                <w:lang w:val="es-AR"/>
-              </w:rPr>
-              <w:t xml:space="preserve">Producto y datos</w:t>
+              <w:keepNext w:val="false"/>
+              <w:suppressAutoHyphens/>
+              <w:spacing w:after="0" w:before="0" w:line="252"/>
+              <w:jc w:val="left"/>
+            </w:pPr>
+            <w:r>
+              <w:rPr>
+                <w:rFonts w:ascii="Lexend" w:cs="Lexend" w:eastAsia="Lexend" w:hAnsi="Lexend"/>
+                <w:color w:val="1A1A1A"/>
+                <w:sz w:val="18"/>
+                <w:szCs w:val="18"/>
+                <w:lang w:val="es-AR"/>
+              </w:rPr>
+              <w:t xml:space="preserve">Producto y operaciones</w:t>
             </w:r>
           </w:p>
         </w:tc>
@@ -10162,20 +10267,20 @@
           </w:tcPr>
           <w:p>
             <w:pPr>
-              <w:keepNext/>
-              <w:suppressAutoHyphens/>
-              <w:spacing w:after="0" w:before="0" w:line="252"/>
-              <w:jc w:val="left"/>
-            </w:pPr>
-            <w:r>
-              <w:rPr>
-                <w:rFonts w:ascii="Lexend" w:cs="Lexend" w:eastAsia="Lexend" w:hAnsi="Lexend"/>
-                <w:color w:val="1A1A1A"/>
-                <w:sz w:val="18"/>
-                <w:szCs w:val="18"/>
-                <w:lang w:val="es-AR"/>
-              </w:rPr>
-              <w:t xml:space="preserve">App del vecino, tablero público, conjunto de datos abiertos e informes</w:t>
+              <w:keepNext w:val="false"/>
+              <w:suppressAutoHyphens/>
+              <w:spacing w:after="0" w:before="0" w:line="252"/>
+              <w:jc w:val="left"/>
+            </w:pPr>
+            <w:r>
+              <w:rPr>
+                <w:rFonts w:ascii="Lexend" w:cs="Lexend" w:eastAsia="Lexend" w:hAnsi="Lexend"/>
+                <w:color w:val="1A1A1A"/>
+                <w:sz w:val="18"/>
+                <w:szCs w:val="18"/>
+                <w:lang w:val="es-AR"/>
+              </w:rPr>
+              <w:t xml:space="preserve">App del vecino, tablero público, conjunto de datos abiertos e informes; ruteo manual de los reclamos durante el piloto, alta de cada municipio nuevo, capacitación de las cuadrillas y mesa de ayuda</w:t>
             </w:r>
           </w:p>
         </w:tc>
@@ -10192,42 +10297,6 @@
           </w:tcPr>
           <w:p>
             <w:pPr>
-              <w:keepNext/>
-              <w:suppressAutoHyphens/>
-              <w:spacing w:after="0" w:before="0" w:line="252"/>
-              <w:jc w:val="left"/>
-            </w:pPr>
-            <w:r>
-              <w:rPr>
-                <w:rFonts w:ascii="Lexend" w:cs="Lexend" w:eastAsia="Lexend" w:hAnsi="Lexend"/>
-                <w:color w:val="1A1A1A"/>
-                <w:sz w:val="18"/>
-                <w:szCs w:val="18"/>
-                <w:lang w:val="es-AR"/>
-              </w:rPr>
-              <w:t xml:space="preserve">H1 — los vecinos usan el canal nuevo</w:t>
-            </w:r>
-          </w:p>
-        </w:tc>
-      </w:tr>
-      <w:tr>
-        <w:trPr>
-          <w:cantSplit/>
-          <w:tblHeader w:val="false"/>
-        </w:trPr>
-        <w:tc>
-          <w:tcPr>
-            <w:tcW w:type="dxa" w:w="2120"/>
-            <w:tcMar>
-              <w:top w:type="dxa" w:w="90"/>
-              <w:left w:type="dxa" w:w="120"/>
-              <w:bottom w:type="dxa" w:w="90"/>
-              <w:right w:type="dxa" w:w="120"/>
-            </w:tcMar>
-            <w:vAlign w:val="top"/>
-          </w:tcPr>
-          <w:p>
-            <w:pPr>
               <w:keepNext w:val="false"/>
               <w:suppressAutoHyphens/>
               <w:spacing w:after="0" w:before="0" w:line="252"/>
@@ -10241,67 +10310,7 @@
                 <w:szCs w:val="18"/>
                 <w:lang w:val="es-AR"/>
               </w:rPr>
-              <w:t xml:space="preserve">Operaciones e implementación</w:t>
-            </w:r>
-          </w:p>
-        </w:tc>
-        <w:tc>
-          <w:tcPr>
-            <w:tcW w:type="dxa" w:w="5397"/>
-            <w:tcMar>
-              <w:top w:type="dxa" w:w="90"/>
-              <w:left w:type="dxa" w:w="120"/>
-              <w:bottom w:type="dxa" w:w="90"/>
-              <w:right w:type="dxa" w:w="120"/>
-            </w:tcMar>
-            <w:vAlign w:val="top"/>
-          </w:tcPr>
-          <w:p>
-            <w:pPr>
-              <w:keepNext w:val="false"/>
-              <w:suppressAutoHyphens/>
-              <w:spacing w:after="0" w:before="0" w:line="252"/>
-              <w:jc w:val="left"/>
-            </w:pPr>
-            <w:r>
-              <w:rPr>
-                <w:rFonts w:ascii="Lexend" w:cs="Lexend" w:eastAsia="Lexend" w:hAnsi="Lexend"/>
-                <w:color w:val="1A1A1A"/>
-                <w:sz w:val="18"/>
-                <w:szCs w:val="18"/>
-                <w:lang w:val="es-AR"/>
-              </w:rPr>
-              <w:t xml:space="preserve">Ruteo manual de los reclamos durante el piloto, alta de cada municipio nuevo, capacitación de las cuadrillas y mesa de ayuda</w:t>
-            </w:r>
-          </w:p>
-        </w:tc>
-        <w:tc>
-          <w:tcPr>
-            <w:tcW w:type="dxa" w:w="2121"/>
-            <w:tcMar>
-              <w:top w:type="dxa" w:w="90"/>
-              <w:left w:type="dxa" w:w="120"/>
-              <w:bottom w:type="dxa" w:w="90"/>
-              <w:right w:type="dxa" w:w="120"/>
-            </w:tcMar>
-            <w:vAlign w:val="top"/>
-          </w:tcPr>
-          <w:p>
-            <w:pPr>
-              <w:keepNext w:val="false"/>
-              <w:suppressAutoHyphens/>
-              <w:spacing w:after="0" w:before="0" w:line="252"/>
-              <w:jc w:val="left"/>
-            </w:pPr>
-            <w:r>
-              <w:rPr>
-                <w:rFonts w:ascii="Lexend" w:cs="Lexend" w:eastAsia="Lexend" w:hAnsi="Lexend"/>
-                <w:color w:val="1A1A1A"/>
-                <w:sz w:val="18"/>
-                <w:szCs w:val="18"/>
-                <w:lang w:val="es-AR"/>
-              </w:rPr>
-              <w:t xml:space="preserve">H2 — buena parte de los reclamos son repetidos</w:t>
+              <w:t xml:space="preserve">H1 — los vecinos usan el canal nuevo; H2 — buena parte de los reclamos son repetidos</w:t>
             </w:r>
           </w:p>
         </w:tc>
@@ -11527,7 +11536,7 @@
                 <w:szCs w:val="18"/>
                 <w:lang w:val="es-AR"/>
               </w:rPr>
-              <w:t xml:space="preserve">Retiro de los cinco cofundadores (5 × USD 800)</w:t>
+              <w:t xml:space="preserve">Retiro de los cuatro cofundadores (4 × USD 1.000)</w:t>
             </w:r>
           </w:p>
         </w:tc>
@@ -12674,7 +12683,7 @@
           <w:szCs w:val="22"/>
           <w:lang w:val="es-AR"/>
         </w:rPr>
-        <w:t xml:space="preserve"> Cinco cofundadores, estudiantes avanzados de Ingeniería en Sistemas de la UTN FRRo, que ya planificaron una plataforma de órdenes de trabajo con app de campo para una empresa de telecomunicaciones. Cada uno lleva un frente y una hipótesis del piloto: dirección y municipios, prestadoras y alianzas, tecnología, producto y datos, y operaciones. El pacto de socios consolida sus acciones en cuatro años.</w:t>
+        <w:t xml:space="preserve"> Cuatro cofundadores, estudiantes avanzados de Ingeniería en Sistemas de la UTN FRRo, que ya planificaron una plataforma de órdenes de trabajo con app de campo para una empresa de telecomunicaciones. Cada uno lleva un frente y responde por las hipótesis del piloto: dirección y municipios, prestadoras y alianzas, tecnología, y producto y operaciones. El pacto de socios consolida sus acciones en cuatro años.</w:t>
       </w:r>
     </w:p>
     <w:p>

</xml_diff>